<commit_message>
ajout de la réponse question 3
</commit_message>
<xml_diff>
--- a/Café du savoir 3.docx
+++ b/Café du savoir 3.docx
@@ -177,51 +177,7 @@
           <w:b/>
           <w:bCs/>
         </w:rPr>
-        <w:t xml:space="preserve">Comment peut-on mesurer </w:t>
-      </w:r>
-      <w:proofErr w:type="gramStart"/>
-      <w:r>
-        <w:rPr>
-          <w:b/>
-          <w:bCs/>
-        </w:rPr>
-        <w:t>l’ «</w:t>
-      </w:r>
-      <w:proofErr w:type="gramEnd"/>
-      <w:r>
-        <w:rPr>
-          <w:b/>
-          <w:bCs/>
-        </w:rPr>
-        <w:t xml:space="preserve"> exposition</w:t>
-      </w:r>
-      <w:r>
-        <w:rPr>
-          <w:b/>
-          <w:bCs/>
-        </w:rPr>
-        <w:t xml:space="preserve"> au </w:t>
-      </w:r>
-      <w:r>
-        <w:rPr>
-          <w:b/>
-          <w:bCs/>
-        </w:rPr>
-        <w:t>risque »</w:t>
-      </w:r>
-      <w:r>
-        <w:rPr>
-          <w:b/>
-          <w:bCs/>
-        </w:rPr>
-        <w:t xml:space="preserve"> dans le contexte du mandat</w:t>
-      </w:r>
-      <w:r>
-        <w:rPr>
-          <w:b/>
-          <w:bCs/>
-        </w:rPr>
-        <w:t>?</w:t>
+        <w:t>Comment peut-on mesurer l’ « exposition au risque » dans le contexte du mandat?</w:t>
       </w:r>
     </w:p>
     <w:p>
@@ -239,10 +195,7 @@
         <w:t>r</w:t>
       </w:r>
       <w:r>
-        <w:t>aud</w:t>
-      </w:r>
-      <w:r>
-        <w:t xml:space="preserve">, l’exposition au risque peut être mesurée par un poids </w:t>
+        <w:t xml:space="preserve">aud, l’exposition au risque peut être mesurée par un poids </w:t>
       </w:r>
       <m:oMath>
         <m:sSub>
@@ -587,14 +540,7 @@
           <w:b/>
           <w:bCs/>
         </w:rPr>
-        <w:t>Exprimez sous forme mathématique le troisième modèle de crédibilité que vous comptez étudier</w:t>
-      </w:r>
-      <w:r>
-        <w:rPr>
-          <w:b/>
-          <w:bCs/>
-        </w:rPr>
-        <w:t>.</w:t>
+        <w:t>Exprimez sous forme mathématique le troisième modèle de crédibilité que vous comptez étudier.</w:t>
       </w:r>
     </w:p>
     <w:p>
@@ -625,7 +571,45 @@
           <w:lang w:eastAsia="fr-CA"/>
           <w14:ligatures w14:val="none"/>
         </w:rPr>
-        <w:t xml:space="preserve"> application est le modèle de Bühlmann-Straud. Plus précisément, nous allons inclure la méthode la méthode paramétrique comme nous l’avons vue en classe. Voici les différents paramètres à calculer pour ce modèle de prévision :</w:t>
+        <w:t xml:space="preserve"> application est le modèle de </w:t>
+      </w:r>
+      <w:proofErr w:type="spellStart"/>
+      <w:r>
+        <w:rPr>
+          <w:rFonts w:eastAsia="Times New Roman" w:cs="Times New Roman"/>
+          <w:kern w:val="0"/>
+          <w:lang w:eastAsia="fr-CA"/>
+          <w14:ligatures w14:val="none"/>
+        </w:rPr>
+        <w:t>Bühlmann</w:t>
+      </w:r>
+      <w:proofErr w:type="spellEnd"/>
+      <w:r>
+        <w:rPr>
+          <w:rFonts w:eastAsia="Times New Roman" w:cs="Times New Roman"/>
+          <w:kern w:val="0"/>
+          <w:lang w:eastAsia="fr-CA"/>
+          <w14:ligatures w14:val="none"/>
+        </w:rPr>
+        <w:t>-Strau</w:t>
+      </w:r>
+      <w:r>
+        <w:rPr>
+          <w:rFonts w:eastAsia="Times New Roman" w:cs="Times New Roman"/>
+          <w:kern w:val="0"/>
+          <w:lang w:eastAsia="fr-CA"/>
+          <w14:ligatures w14:val="none"/>
+        </w:rPr>
+        <w:t>b</w:t>
+      </w:r>
+      <w:r>
+        <w:rPr>
+          <w:rFonts w:eastAsia="Times New Roman" w:cs="Times New Roman"/>
+          <w:kern w:val="0"/>
+          <w:lang w:eastAsia="fr-CA"/>
+          <w14:ligatures w14:val="none"/>
+        </w:rPr>
+        <w:t>. Plus précisément, nous allons inclure la méthode la méthode paramétrique comme nous l’avons vue en classe. Voici les différents paramètres à calculer pour ce modèle de prévision :</w:t>
       </w:r>
       <w:r>
         <w:rPr>
@@ -1615,6 +1599,9 @@
             </m:e>
           </m:nary>
           <m:r>
+            <m:rPr>
+              <m:sty m:val="p"/>
+            </m:rPr>
             <w:rPr>
               <w:rFonts w:eastAsia="Times New Roman" w:cs="Times New Roman"/>
               <w:kern w:val="0"/>
@@ -1931,16 +1918,7 @@
                   <w:lang w:eastAsia="fr-CA"/>
                   <w14:ligatures w14:val="none"/>
                 </w:rPr>
-                <m:t xml:space="preserve">;   </m:t>
-              </m:r>
-              <m:r>
-                <w:rPr>
-                  <w:rFonts w:ascii="Cambria Math" w:eastAsia="Times New Roman" w:hAnsi="Cambria Math" w:cs="Times New Roman"/>
-                  <w:kern w:val="0"/>
-                  <w:lang w:eastAsia="fr-CA"/>
-                  <w14:ligatures w14:val="none"/>
-                </w:rPr>
-                <m:t>X</m:t>
+                <m:t>;   X</m:t>
               </m:r>
             </m:e>
             <m:sub>
@@ -2160,16 +2138,7 @@
                   <w:lang w:eastAsia="fr-CA"/>
                   <w14:ligatures w14:val="none"/>
                 </w:rPr>
-                <m:t>ww</m:t>
-              </m:r>
-              <m:r>
-                <w:rPr>
-                  <w:rFonts w:ascii="Cambria Math" w:eastAsia="Times New Roman" w:hAnsi="Cambria Math" w:cs="Times New Roman"/>
-                  <w:kern w:val="0"/>
-                  <w:lang w:eastAsia="fr-CA"/>
-                  <w14:ligatures w14:val="none"/>
-                </w:rPr>
-                <m:t>∙</m:t>
+                <m:t>ww∙</m:t>
               </m:r>
             </m:sub>
           </m:sSub>
@@ -2357,6 +2326,9 @@
             </m:sub>
           </m:sSub>
           <m:r>
+            <m:rPr>
+              <m:sty m:val="p"/>
+            </m:rPr>
             <w:rPr>
               <w:rFonts w:eastAsia="Times New Roman" w:cs="Times New Roman"/>
               <w:kern w:val="0"/>
@@ -2648,16 +2620,7 @@
             <w:lang w:eastAsia="fr-CA"/>
             <w14:ligatures w14:val="none"/>
           </w:rPr>
-          <m:t>m</m:t>
-        </m:r>
-        <m:r>
-          <w:rPr>
-            <w:rFonts w:ascii="Cambria Math" w:eastAsia="Times New Roman" w:hAnsi="Cambria Math" w:cs="Times New Roman"/>
-            <w:kern w:val="0"/>
-            <w:lang w:eastAsia="fr-CA"/>
-            <w14:ligatures w14:val="none"/>
-          </w:rPr>
-          <m:t>;</m:t>
+          <m:t>m;</m:t>
         </m:r>
       </m:oMath>
       <w:r>
@@ -2929,35 +2892,201 @@
     </w:p>
     <w:p>
       <w:pPr>
+        <w:pStyle w:val="NormalWeb"/>
+        <w:ind w:left="720"/>
+        <w:rPr>
+          <w:rFonts w:asciiTheme="minorHAnsi" w:hAnsiTheme="minorHAnsi"/>
+          <w:sz w:val="22"/>
+          <w:szCs w:val="22"/>
+        </w:rPr>
+      </w:pPr>
+      <w:r>
+        <w:rPr>
+          <w:rFonts w:asciiTheme="minorHAnsi" w:hAnsiTheme="minorHAnsi"/>
+          <w:sz w:val="22"/>
+          <w:szCs w:val="22"/>
+        </w:rPr>
+        <w:t xml:space="preserve">Dans notre application, nous présentons trois modèles de crédibilité, soit les modèles bayésien, de </w:t>
+      </w:r>
+      <w:proofErr w:type="spellStart"/>
+      <w:r>
+        <w:rPr>
+          <w:rFonts w:asciiTheme="minorHAnsi" w:hAnsiTheme="minorHAnsi"/>
+          <w:sz w:val="22"/>
+          <w:szCs w:val="22"/>
+        </w:rPr>
+        <w:t>Bühlmann</w:t>
+      </w:r>
+      <w:proofErr w:type="spellEnd"/>
+      <w:r>
+        <w:rPr>
+          <w:rFonts w:asciiTheme="minorHAnsi" w:hAnsiTheme="minorHAnsi"/>
+          <w:sz w:val="22"/>
+          <w:szCs w:val="22"/>
+        </w:rPr>
+        <w:t xml:space="preserve"> et de </w:t>
+      </w:r>
+      <w:proofErr w:type="spellStart"/>
+      <w:r>
+        <w:rPr>
+          <w:rFonts w:asciiTheme="minorHAnsi" w:hAnsiTheme="minorHAnsi"/>
+          <w:sz w:val="22"/>
+          <w:szCs w:val="22"/>
+        </w:rPr>
+        <w:t>Bühlmann</w:t>
+      </w:r>
+      <w:proofErr w:type="spellEnd"/>
+      <w:r>
+        <w:rPr>
+          <w:rFonts w:asciiTheme="minorHAnsi" w:hAnsiTheme="minorHAnsi"/>
+          <w:sz w:val="22"/>
+          <w:szCs w:val="22"/>
+        </w:rPr>
+        <w:t>-Straub, afin de comparer leurs performances.</w:t>
+      </w:r>
+    </w:p>
+    <w:p>
+      <w:pPr>
+        <w:pStyle w:val="NormalWeb"/>
+        <w:ind w:left="720"/>
+        <w:rPr>
+          <w:rFonts w:asciiTheme="minorHAnsi" w:hAnsiTheme="minorHAnsi"/>
+          <w:sz w:val="22"/>
+          <w:szCs w:val="22"/>
+        </w:rPr>
+      </w:pPr>
+      <w:r>
+        <w:rPr>
+          <w:rFonts w:asciiTheme="minorHAnsi" w:hAnsiTheme="minorHAnsi"/>
+          <w:sz w:val="22"/>
+          <w:szCs w:val="22"/>
+        </w:rPr>
+        <w:t>Le choix du modèle final repose sur une analyse de la performance prédictive à l’aide des données de test (rondes partielles), en utilisant des mesures telles que l’erreur absolue moyenne (MAE), l’erreur quadratique moyenne (RMSE) et le biais.</w:t>
+      </w:r>
+    </w:p>
+    <w:p>
+      <w:pPr>
+        <w:pStyle w:val="NormalWeb"/>
+        <w:ind w:left="720"/>
+        <w:rPr>
+          <w:rFonts w:asciiTheme="minorHAnsi" w:hAnsiTheme="minorHAnsi"/>
+          <w:sz w:val="22"/>
+          <w:szCs w:val="22"/>
+        </w:rPr>
+      </w:pPr>
+      <w:r>
+        <w:rPr>
+          <w:rFonts w:asciiTheme="minorHAnsi" w:hAnsiTheme="minorHAnsi"/>
+          <w:sz w:val="22"/>
+          <w:szCs w:val="22"/>
+        </w:rPr>
+        <w:t xml:space="preserve">Bien que les trois modèles soient présentés dans l’application, le modèle de </w:t>
+      </w:r>
+      <w:proofErr w:type="spellStart"/>
+      <w:r>
+        <w:rPr>
+          <w:rFonts w:asciiTheme="minorHAnsi" w:hAnsiTheme="minorHAnsi"/>
+          <w:sz w:val="22"/>
+          <w:szCs w:val="22"/>
+        </w:rPr>
+        <w:t>Bühlmann</w:t>
+      </w:r>
+      <w:proofErr w:type="spellEnd"/>
+      <w:r>
+        <w:rPr>
+          <w:rFonts w:asciiTheme="minorHAnsi" w:hAnsiTheme="minorHAnsi"/>
+          <w:sz w:val="22"/>
+          <w:szCs w:val="22"/>
+        </w:rPr>
+        <w:t xml:space="preserve">-Straub est particulièrement pertinent dans notre contexte puisqu’il permet de tenir compte de l’exposition au risque à l’aide de poids </w:t>
+      </w:r>
+      <m:oMath>
+        <m:sSub>
+          <m:sSubPr>
+            <m:ctrlPr>
+              <w:rPr>
+                <w:rFonts w:ascii="Cambria Math" w:hAnsi="Cambria Math"/>
+                <w:sz w:val="22"/>
+                <w:szCs w:val="22"/>
+              </w:rPr>
+            </m:ctrlPr>
+          </m:sSubPr>
+          <m:e>
+            <m:r>
+              <w:rPr>
+                <w:rFonts w:ascii="Cambria Math" w:hAnsi="Cambria Math"/>
+                <w:sz w:val="22"/>
+                <w:szCs w:val="22"/>
+              </w:rPr>
+              <m:t>w</m:t>
+            </m:r>
+          </m:e>
+          <m:sub>
+            <m:r>
+              <w:rPr>
+                <w:rFonts w:ascii="Cambria Math" w:hAnsi="Cambria Math"/>
+                <w:sz w:val="22"/>
+                <w:szCs w:val="22"/>
+              </w:rPr>
+              <m:t>it</m:t>
+            </m:r>
+          </m:sub>
+        </m:sSub>
+      </m:oMath>
+      <w:r>
+        <w:rPr>
+          <w:rFonts w:asciiTheme="minorHAnsi" w:hAnsiTheme="minorHAnsi"/>
+          <w:sz w:val="22"/>
+          <w:szCs w:val="22"/>
+        </w:rPr>
+        <w:t>, ce qui est cohérent avec la structure des données observées.</w:t>
+      </w:r>
+    </w:p>
+    <w:p>
+      <w:pPr>
+        <w:pStyle w:val="NormalWeb"/>
+        <w:ind w:left="720"/>
+        <w:rPr>
+          <w:rFonts w:asciiTheme="minorHAnsi" w:hAnsiTheme="minorHAnsi"/>
+          <w:sz w:val="22"/>
+          <w:szCs w:val="22"/>
+        </w:rPr>
+      </w:pPr>
+      <w:r>
+        <w:rPr>
+          <w:rFonts w:asciiTheme="minorHAnsi" w:hAnsiTheme="minorHAnsi"/>
+          <w:sz w:val="22"/>
+          <w:szCs w:val="22"/>
+        </w:rPr>
+        <w:t xml:space="preserve">Ainsi, en fonction des résultats empiriques et de la capacité du modèle à bien représenter l’exposition, le modèle de </w:t>
+      </w:r>
+      <w:proofErr w:type="spellStart"/>
+      <w:r>
+        <w:rPr>
+          <w:rFonts w:asciiTheme="minorHAnsi" w:hAnsiTheme="minorHAnsi"/>
+          <w:sz w:val="22"/>
+          <w:szCs w:val="22"/>
+        </w:rPr>
+        <w:t>Bühlmann</w:t>
+      </w:r>
+      <w:proofErr w:type="spellEnd"/>
+      <w:r>
+        <w:rPr>
+          <w:rFonts w:asciiTheme="minorHAnsi" w:hAnsiTheme="minorHAnsi"/>
+          <w:sz w:val="22"/>
+          <w:szCs w:val="22"/>
+        </w:rPr>
+        <w:t>-Straub peut être recommandé comme modèle principal.</w:t>
+      </w:r>
+    </w:p>
+    <w:p>
+      <w:pPr>
         <w:pStyle w:val="Paragraphedeliste"/>
         <w:rPr>
           <w:b/>
           <w:bCs/>
         </w:rPr>
       </w:pPr>
-      <w:r>
-        <w:rPr>
-          <w:b/>
-          <w:bCs/>
-        </w:rPr>
-        <w:t xml:space="preserve">Je ne suis pas certains de comprendre </w:t>
-      </w:r>
-      <w:proofErr w:type="gramStart"/>
-      <w:r>
-        <w:rPr>
-          <w:b/>
-          <w:bCs/>
-        </w:rPr>
-        <w:t>cette questions</w:t>
-      </w:r>
-      <w:proofErr w:type="gramEnd"/>
-      <w:r>
-        <w:rPr>
-          <w:b/>
-          <w:bCs/>
-        </w:rPr>
-        <w:t>, est-ce que quelqu’un qui la comprend pourrais la faire ou me l’expliquer svp.</w:t>
-      </w:r>
     </w:p>
     <w:sectPr>
       <w:pgSz w:w="12240" w:h="15840"/>
@@ -3669,6 +3798,7 @@
   <w:style w:type="character" w:default="1" w:styleId="Policepardfaut">
     <w:name w:val="Default Paragraph Font"/>
     <w:uiPriority w:val="1"/>
+    <w:semiHidden/>
     <w:unhideWhenUsed/>
   </w:style>
   <w:style w:type="table" w:default="1" w:styleId="TableauNormal">
@@ -4310,6 +4440,23 @@
 </file>
 
 <file path=customXml/item1.xml><?xml version="1.0" encoding="utf-8"?>
+<p:properties xmlns:p="http://schemas.microsoft.com/office/2006/metadata/properties" xmlns:xsi="http://www.w3.org/2001/XMLSchema-instance" xmlns:pc="http://schemas.microsoft.com/office/infopath/2007/PartnerControls">
+  <documentManagement>
+    <_activity xmlns="7cd8c61a-fd18-4603-8755-d91a22d67d2b" xsi:nil="true"/>
+  </documentManagement>
+</p:properties>
+</file>
+
+<file path=customXml/item2.xml><?xml version="1.0" encoding="utf-8"?>
+<?mso-contentType ?>
+<FormTemplates xmlns="http://schemas.microsoft.com/sharepoint/v3/contenttype/forms">
+  <Display>DocumentLibraryForm</Display>
+  <Edit>DocumentLibraryForm</Edit>
+  <New>DocumentLibraryForm</New>
+</FormTemplates>
+</file>
+
+<file path=customXml/item3.xml><?xml version="1.0" encoding="utf-8"?>
 <ct:contentTypeSchema xmlns:ct="http://schemas.microsoft.com/office/2006/metadata/contentType" xmlns:ma="http://schemas.microsoft.com/office/2006/metadata/properties/metaAttributes" ct:_="" ma:_="" ma:contentTypeName="Document" ma:contentTypeID="0x010100C34E2965E001094BB667583607E2D7E3" ma:contentTypeVersion="8" ma:contentTypeDescription="Create a new document." ma:contentTypeScope="" ma:versionID="73661d776941e9e3c710a32cd248c220">
   <xsd:schema xmlns:xsd="http://www.w3.org/2001/XMLSchema" xmlns:xs="http://www.w3.org/2001/XMLSchema" xmlns:p="http://schemas.microsoft.com/office/2006/metadata/properties" xmlns:ns3="7cd8c61a-fd18-4603-8755-d91a22d67d2b" xmlns:ns4="1f336702-64c3-405d-b44c-b3f5d9ffe49b" targetNamespace="http://schemas.microsoft.com/office/2006/metadata/properties" ma:root="true" ma:fieldsID="ba50763595f2e038a40d1a9ef53661d7" ns3:_="" ns4:_="">
     <xsd:import namespace="7cd8c61a-fd18-4603-8755-d91a22d67d2b"/>
@@ -4498,24 +4645,25 @@
 </ct:contentTypeSchema>
 </file>
 
-<file path=customXml/item2.xml><?xml version="1.0" encoding="utf-8"?>
-<?mso-contentType ?>
-<FormTemplates xmlns="http://schemas.microsoft.com/sharepoint/v3/contenttype/forms">
-  <Display>DocumentLibraryForm</Display>
-  <Edit>DocumentLibraryForm</Edit>
-  <New>DocumentLibraryForm</New>
-</FormTemplates>
+<file path=customXml/itemProps1.xml><?xml version="1.0" encoding="utf-8"?>
+<ds:datastoreItem xmlns:ds="http://schemas.openxmlformats.org/officeDocument/2006/customXml" ds:itemID="{F846B2DC-6610-43C6-86D1-D3F5854E6D47}">
+  <ds:schemaRefs>
+    <ds:schemaRef ds:uri="http://schemas.microsoft.com/office/2006/metadata/properties"/>
+    <ds:schemaRef ds:uri="http://schemas.microsoft.com/office/infopath/2007/PartnerControls"/>
+    <ds:schemaRef ds:uri="7cd8c61a-fd18-4603-8755-d91a22d67d2b"/>
+  </ds:schemaRefs>
+</ds:datastoreItem>
 </file>
 
-<file path=customXml/item3.xml><?xml version="1.0" encoding="utf-8"?>
-<p:properties xmlns:p="http://schemas.microsoft.com/office/2006/metadata/properties" xmlns:xsi="http://www.w3.org/2001/XMLSchema-instance" xmlns:pc="http://schemas.microsoft.com/office/infopath/2007/PartnerControls">
-  <documentManagement>
-    <_activity xmlns="7cd8c61a-fd18-4603-8755-d91a22d67d2b" xsi:nil="true"/>
-  </documentManagement>
-</p:properties>
+<file path=customXml/itemProps2.xml><?xml version="1.0" encoding="utf-8"?>
+<ds:datastoreItem xmlns:ds="http://schemas.openxmlformats.org/officeDocument/2006/customXml" ds:itemID="{4BF2ACCA-A08C-447D-9B60-491EFF60D57A}">
+  <ds:schemaRefs>
+    <ds:schemaRef ds:uri="http://schemas.microsoft.com/sharepoint/v3/contenttype/forms"/>
+  </ds:schemaRefs>
+</ds:datastoreItem>
 </file>
 
-<file path=customXml/itemProps1.xml><?xml version="1.0" encoding="utf-8"?>
+<file path=customXml/itemProps3.xml><?xml version="1.0" encoding="utf-8"?>
 <ds:datastoreItem xmlns:ds="http://schemas.openxmlformats.org/officeDocument/2006/customXml" ds:itemID="{DFF3C3D9-2FD0-49BB-9541-8E240B5F0EA3}">
   <ds:schemaRefs>
     <ds:schemaRef ds:uri="http://schemas.microsoft.com/office/2006/metadata/contentType"/>
@@ -4532,22 +4680,4 @@
     <ds:schemaRef ds:uri="http://schemas.microsoft.com/internal/obd"/>
   </ds:schemaRefs>
 </ds:datastoreItem>
-</file>
-
-<file path=customXml/itemProps2.xml><?xml version="1.0" encoding="utf-8"?>
-<ds:datastoreItem xmlns:ds="http://schemas.openxmlformats.org/officeDocument/2006/customXml" ds:itemID="{4BF2ACCA-A08C-447D-9B60-491EFF60D57A}">
-  <ds:schemaRefs>
-    <ds:schemaRef ds:uri="http://schemas.microsoft.com/sharepoint/v3/contenttype/forms"/>
-  </ds:schemaRefs>
-</ds:datastoreItem>
-</file>
-
-<file path=customXml/itemProps3.xml><?xml version="1.0" encoding="utf-8"?>
-<ds:datastoreItem xmlns:ds="http://schemas.openxmlformats.org/officeDocument/2006/customXml" ds:itemID="{F846B2DC-6610-43C6-86D1-D3F5854E6D47}">
-  <ds:schemaRefs>
-    <ds:schemaRef ds:uri="http://schemas.microsoft.com/office/2006/metadata/properties"/>
-    <ds:schemaRef ds:uri="http://schemas.microsoft.com/office/infopath/2007/PartnerControls"/>
-    <ds:schemaRef ds:uri="7cd8c61a-fd18-4603-8755-d91a22d67d2b"/>
-  </ds:schemaRefs>
-</ds:datastoreItem>
 </file>
</xml_diff>

<commit_message>
petite correction question 1.
J'ai modifié la réponse à la question , à partir de la seconde phrase du paragraphe.
</commit_message>
<xml_diff>
--- a/Café du savoir 3.docx
+++ b/Café du savoir 3.docx
@@ -179,7 +179,6 @@
         </w:rPr>
         <w:t xml:space="preserve">Comment peut-on mesurer </w:t>
       </w:r>
-      <w:proofErr w:type="gramStart"/>
       <w:r>
         <w:rPr>
           <w:b/>
@@ -187,7 +186,6 @@
         </w:rPr>
         <w:t>l’ «</w:t>
       </w:r>
-      <w:proofErr w:type="gramEnd"/>
       <w:r>
         <w:rPr>
           <w:b/>
@@ -199,10 +197,6 @@
     <w:p>
       <w:pPr>
         <w:pStyle w:val="Paragraphedeliste"/>
-        <w:rPr>
-          <w:b/>
-          <w:bCs/>
-        </w:rPr>
       </w:pPr>
       <w:r>
         <w:t>Selon notre contexte et le modèle de crédibilité Bühlmann-St</w:t>
@@ -247,25 +241,7 @@
         <w:t xml:space="preserve"> </w:t>
       </w:r>
       <w:r>
-        <w:t xml:space="preserve">Ce poids </w:t>
-      </w:r>
-      <w:r>
-        <w:t>représen</w:t>
-      </w:r>
-      <w:r>
-        <w:t>te</w:t>
-      </w:r>
-      <w:r>
-        <w:t xml:space="preserve"> la proportion de la période pendant laquelle l’assuré a été exposé au risque durant l’année. Par exemple, </w:t>
-      </w:r>
-      <w:r>
-        <w:t xml:space="preserve">pour </w:t>
-      </w:r>
-      <w:r>
-        <w:t>une année complète</w:t>
-      </w:r>
-      <w:r>
-        <w:t xml:space="preserve">, on aurait un poids de </w:t>
+        <w:t xml:space="preserve">Le poids </w:t>
       </w:r>
       <m:oMath>
         <m:sSub>
@@ -297,60 +273,21 @@
           <w:rPr>
             <w:rFonts w:ascii="Cambria Math" w:hAnsi="Cambria Math"/>
           </w:rPr>
-          <m:t>=1</m:t>
+          <m:t xml:space="preserve"> </m:t>
         </m:r>
       </m:oMath>
       <w:r>
-        <w:t xml:space="preserve">, </w:t>
-      </w:r>
-      <w:r>
-        <w:t xml:space="preserve">tandis que pour </w:t>
-      </w:r>
-      <w:r>
-        <w:t>six mois</w:t>
-      </w:r>
-      <w:r>
-        <w:t>, on aurait un poids</w:t>
-      </w:r>
-      <w:r>
-        <w:t xml:space="preserve"> </w:t>
-      </w:r>
-      <m:oMath>
-        <m:sSub>
-          <m:sSubPr>
-            <m:ctrlPr>
-              <w:rPr>
-                <w:rFonts w:ascii="Cambria Math" w:hAnsi="Cambria Math"/>
-              </w:rPr>
-            </m:ctrlPr>
-          </m:sSubPr>
-          <m:e>
-            <m:r>
-              <w:rPr>
-                <w:rFonts w:ascii="Cambria Math" w:hAnsi="Cambria Math"/>
-              </w:rPr>
-              <m:t>w</m:t>
-            </m:r>
-          </m:e>
-          <m:sub>
-            <m:r>
-              <w:rPr>
-                <w:rFonts w:ascii="Cambria Math" w:hAnsi="Cambria Math"/>
-              </w:rPr>
-              <m:t>it</m:t>
-            </m:r>
-          </m:sub>
-        </m:sSub>
-        <m:r>
-          <w:rPr>
-            <w:rFonts w:ascii="Cambria Math" w:hAnsi="Cambria Math"/>
-          </w:rPr>
-          <m:t>=0.5</m:t>
-        </m:r>
-      </m:oMath>
-      <w:r>
-        <w:t xml:space="preserve">. </w:t>
-      </w:r>
+        <w:t>représente la quantité d’exposition au risque associée à l’assuré pendant la période considérée. Cette période n’est pas nécessairement une année : elle peut correspondre, selon le contexte, à un trimestre, un semestre, une année ou toute autre unité de temps pertinente. Par ailleurs, l’exposition au risque peut être mesurée de différentes façons. Elle peut, par exemple, être évaluée à l’aide du nombre d’employés couverts ou encore de la masse salariale de l’employeur.</w:t>
+      </w:r>
+    </w:p>
+    <w:p>
+      <w:pPr>
+        <w:pStyle w:val="Paragraphedeliste"/>
+        <w:rPr>
+          <w:b/>
+          <w:bCs/>
+        </w:rPr>
+      </w:pPr>
       <w:r>
         <w:t>Dans le modèle de Bühlmann-Straud</w:t>
       </w:r>
@@ -593,9 +530,8 @@
           <w:lang w:eastAsia="fr-CA"/>
           <w14:ligatures w14:val="none"/>
         </w:rPr>
-        <w:t xml:space="preserve"> application est le modèle de </w:t>
-      </w:r>
-      <w:proofErr w:type="spellStart"/>
+        <w:t xml:space="preserve"> application est le modèle de Bühlmann-Strau</w:t>
+      </w:r>
       <w:r>
         <w:rPr>
           <w:rFonts w:eastAsia="Times New Roman" w:cs="Times New Roman"/>
@@ -603,9 +539,8 @@
           <w:lang w:eastAsia="fr-CA"/>
           <w14:ligatures w14:val="none"/>
         </w:rPr>
-        <w:t>Bühlmann</w:t>
-      </w:r>
-      <w:proofErr w:type="spellEnd"/>
+        <w:t>b</w:t>
+      </w:r>
       <w:r>
         <w:rPr>
           <w:rFonts w:eastAsia="Times New Roman" w:cs="Times New Roman"/>
@@ -613,61 +548,7 @@
           <w:lang w:eastAsia="fr-CA"/>
           <w14:ligatures w14:val="none"/>
         </w:rPr>
-        <w:t>-Strau</w:t>
-      </w:r>
-      <w:r>
-        <w:rPr>
-          <w:rFonts w:eastAsia="Times New Roman" w:cs="Times New Roman"/>
-          <w:kern w:val="0"/>
-          <w:lang w:eastAsia="fr-CA"/>
-          <w14:ligatures w14:val="none"/>
-        </w:rPr>
-        <w:t>b</w:t>
-      </w:r>
-      <w:r>
-        <w:rPr>
-          <w:rFonts w:eastAsia="Times New Roman" w:cs="Times New Roman"/>
-          <w:kern w:val="0"/>
-          <w:lang w:eastAsia="fr-CA"/>
-          <w14:ligatures w14:val="none"/>
-        </w:rPr>
-        <w:t xml:space="preserve">. Plus précisément, nous allons </w:t>
-      </w:r>
-      <w:r>
-        <w:rPr>
-          <w:rFonts w:eastAsia="Times New Roman" w:cs="Times New Roman"/>
-          <w:kern w:val="0"/>
-          <w:lang w:eastAsia="fr-CA"/>
-          <w14:ligatures w14:val="none"/>
-        </w:rPr>
-        <w:t>utiliser</w:t>
-      </w:r>
-      <w:r>
-        <w:rPr>
-          <w:rFonts w:eastAsia="Times New Roman" w:cs="Times New Roman"/>
-          <w:kern w:val="0"/>
-          <w:lang w:eastAsia="fr-CA"/>
-          <w14:ligatures w14:val="none"/>
-        </w:rPr>
-        <w:t xml:space="preserve"> l</w:t>
-      </w:r>
-      <w:r>
-        <w:rPr>
-          <w:rFonts w:eastAsia="Times New Roman" w:cs="Times New Roman"/>
-          <w:kern w:val="0"/>
-          <w:lang w:eastAsia="fr-CA"/>
-          <w14:ligatures w14:val="none"/>
-        </w:rPr>
-        <w:t xml:space="preserve">’approche </w:t>
-      </w:r>
-      <w:r>
-        <w:rPr>
-          <w:rFonts w:eastAsia="Times New Roman" w:cs="Times New Roman"/>
-          <w:kern w:val="0"/>
-          <w:lang w:eastAsia="fr-CA"/>
-          <w14:ligatures w14:val="none"/>
-        </w:rPr>
-        <w:t>paramétrique comme nous l’avons vue en classe. Voici les différents paramètres à calculer pour ce modèle de prévision :</w:t>
+        <w:t>. Plus précisément, nous allons inclure la méthode la méthode paramétrique comme nous l’avons vue en classe. Voici les différents paramètres à calculer pour ce modèle de prévision :</w:t>
       </w:r>
       <w:r>
         <w:rPr>
@@ -786,272 +667,279 @@
           <w14:ligatures w14:val="none"/>
         </w:rPr>
       </w:pPr>
-      <m:oMathPara>
-        <m:oMath>
-          <m:acc>
-            <m:accPr>
-              <m:ctrlPr>
-                <w:rPr>
-                  <w:rFonts w:ascii="Cambria Math" w:eastAsia="Times New Roman" w:hAnsi="Cambria Math" w:cs="Times New Roman"/>
-                  <w:i/>
-                  <w:kern w:val="0"/>
-                  <w:lang w:eastAsia="fr-CA"/>
-                  <w14:ligatures w14:val="none"/>
-                </w:rPr>
-              </m:ctrlPr>
-            </m:accPr>
-            <m:e>
-              <m:r>
-                <w:rPr>
-                  <w:rFonts w:ascii="Cambria Math" w:eastAsia="Times New Roman" w:hAnsi="Cambria Math" w:cs="Times New Roman"/>
-                  <w:kern w:val="0"/>
-                  <w:lang w:eastAsia="fr-CA"/>
-                  <w14:ligatures w14:val="none"/>
-                </w:rPr>
-                <m:t>m</m:t>
-              </m:r>
-            </m:e>
-          </m:acc>
-          <m:r>
-            <w:rPr>
-              <w:rFonts w:ascii="Cambria Math" w:eastAsia="Times New Roman" w:hAnsi="Cambria Math" w:cs="Times New Roman"/>
-              <w:kern w:val="0"/>
-              <w:lang w:eastAsia="fr-CA"/>
-              <w14:ligatures w14:val="none"/>
-            </w:rPr>
-            <m:t>=</m:t>
-          </m:r>
-          <m:sSub>
-            <m:sSubPr>
-              <m:ctrlPr>
-                <w:rPr>
-                  <w:rFonts w:ascii="Cambria Math" w:eastAsia="Times New Roman" w:hAnsi="Cambria Math" w:cs="Times New Roman"/>
-                  <w:i/>
-                  <w:kern w:val="0"/>
-                  <w:lang w:eastAsia="fr-CA"/>
-                  <w14:ligatures w14:val="none"/>
-                </w:rPr>
-              </m:ctrlPr>
-            </m:sSubPr>
-            <m:e>
-              <m:r>
-                <w:rPr>
-                  <w:rFonts w:ascii="Cambria Math" w:eastAsia="Times New Roman" w:hAnsi="Cambria Math" w:cs="Times New Roman"/>
-                  <w:kern w:val="0"/>
-                  <w:lang w:eastAsia="fr-CA"/>
-                  <w14:ligatures w14:val="none"/>
-                </w:rPr>
-                <m:t>X</m:t>
-              </m:r>
-            </m:e>
-            <m:sub>
-              <m:r>
-                <w:rPr>
-                  <w:rFonts w:ascii="Cambria Math" w:eastAsia="Times New Roman" w:hAnsi="Cambria Math" w:cs="Times New Roman"/>
-                  <w:kern w:val="0"/>
-                  <w:lang w:eastAsia="fr-CA"/>
-                  <w14:ligatures w14:val="none"/>
-                </w:rPr>
-                <m:t>ww</m:t>
-              </m:r>
-            </m:sub>
-          </m:sSub>
-          <m:r>
-            <w:rPr>
-              <w:rFonts w:ascii="Cambria Math" w:eastAsia="Times New Roman" w:hAnsi="Cambria Math" w:cs="Times New Roman"/>
-              <w:kern w:val="0"/>
-              <w:lang w:eastAsia="fr-CA"/>
-              <w14:ligatures w14:val="none"/>
-            </w:rPr>
-            <m:t>=</m:t>
-          </m:r>
-          <m:nary>
-            <m:naryPr>
-              <m:chr m:val="∑"/>
-              <m:limLoc m:val="undOvr"/>
-              <m:ctrlPr>
-                <w:rPr>
-                  <w:rFonts w:ascii="Cambria Math" w:eastAsia="Times New Roman" w:hAnsi="Cambria Math" w:cs="Times New Roman"/>
-                  <w:i/>
-                  <w:kern w:val="0"/>
-                  <w:lang w:eastAsia="fr-CA"/>
-                  <w14:ligatures w14:val="none"/>
-                </w:rPr>
-              </m:ctrlPr>
-            </m:naryPr>
-            <m:sub>
-              <m:r>
-                <w:rPr>
-                  <w:rFonts w:ascii="Cambria Math" w:eastAsia="Times New Roman" w:hAnsi="Cambria Math" w:cs="Times New Roman"/>
-                  <w:kern w:val="0"/>
-                  <w:lang w:eastAsia="fr-CA"/>
-                  <w14:ligatures w14:val="none"/>
-                </w:rPr>
-                <m:t>i=1</m:t>
-              </m:r>
-            </m:sub>
-            <m:sup>
-              <m:r>
-                <w:rPr>
-                  <w:rFonts w:ascii="Cambria Math" w:eastAsia="Times New Roman" w:hAnsi="Cambria Math" w:cs="Times New Roman"/>
-                  <w:kern w:val="0"/>
-                  <w:lang w:eastAsia="fr-CA"/>
-                  <w14:ligatures w14:val="none"/>
-                </w:rPr>
-                <m:t>I</m:t>
-              </m:r>
-            </m:sup>
-            <m:e>
-              <m:d>
-                <m:dPr>
-                  <m:ctrlPr>
-                    <w:rPr>
-                      <w:rFonts w:ascii="Cambria Math" w:eastAsia="Times New Roman" w:hAnsi="Cambria Math" w:cs="Times New Roman"/>
-                      <w:i/>
-                      <w:kern w:val="0"/>
-                      <w:lang w:eastAsia="fr-CA"/>
-                      <w14:ligatures w14:val="none"/>
-                    </w:rPr>
-                  </m:ctrlPr>
-                </m:dPr>
-                <m:e>
-                  <m:f>
-                    <m:fPr>
-                      <m:ctrlPr>
-                        <w:rPr>
-                          <w:rFonts w:ascii="Cambria Math" w:eastAsia="Times New Roman" w:hAnsi="Cambria Math" w:cs="Times New Roman"/>
-                          <w:i/>
-                          <w:kern w:val="0"/>
-                          <w:lang w:eastAsia="fr-CA"/>
-                          <w14:ligatures w14:val="none"/>
-                        </w:rPr>
-                      </m:ctrlPr>
-                    </m:fPr>
-                    <m:num>
-                      <m:sSub>
-                        <m:sSubPr>
-                          <m:ctrlPr>
-                            <w:rPr>
-                              <w:rFonts w:ascii="Cambria Math" w:eastAsia="Times New Roman" w:hAnsi="Cambria Math" w:cs="Times New Roman"/>
-                              <w:i/>
-                              <w:kern w:val="0"/>
-                              <w:lang w:eastAsia="fr-CA"/>
-                              <w14:ligatures w14:val="none"/>
-                            </w:rPr>
-                          </m:ctrlPr>
-                        </m:sSubPr>
-                        <m:e>
-                          <m:r>
-                            <w:rPr>
-                              <w:rFonts w:ascii="Cambria Math" w:eastAsia="Times New Roman" w:hAnsi="Cambria Math" w:cs="Times New Roman"/>
-                              <w:kern w:val="0"/>
-                              <w:lang w:eastAsia="fr-CA"/>
-                              <w14:ligatures w14:val="none"/>
-                            </w:rPr>
-                            <m:t>w</m:t>
-                          </m:r>
-                        </m:e>
-                        <m:sub>
-                          <m:r>
-                            <w:rPr>
-                              <w:rFonts w:ascii="Cambria Math" w:eastAsia="Times New Roman" w:hAnsi="Cambria Math" w:cs="Times New Roman"/>
-                              <w:kern w:val="0"/>
-                              <w:lang w:eastAsia="fr-CA"/>
-                              <w14:ligatures w14:val="none"/>
-                            </w:rPr>
-                            <m:t>i∙</m:t>
-                          </m:r>
-                        </m:sub>
-                      </m:sSub>
-                    </m:num>
-                    <m:den>
-                      <m:sSub>
-                        <m:sSubPr>
-                          <m:ctrlPr>
-                            <w:rPr>
-                              <w:rFonts w:ascii="Cambria Math" w:eastAsia="Times New Roman" w:hAnsi="Cambria Math" w:cs="Times New Roman"/>
-                              <w:i/>
-                              <w:kern w:val="0"/>
-                              <w:lang w:eastAsia="fr-CA"/>
-                              <w14:ligatures w14:val="none"/>
-                            </w:rPr>
-                          </m:ctrlPr>
-                        </m:sSubPr>
-                        <m:e>
-                          <m:r>
-                            <w:rPr>
-                              <w:rFonts w:ascii="Cambria Math" w:eastAsia="Times New Roman" w:hAnsi="Cambria Math" w:cs="Times New Roman"/>
-                              <w:kern w:val="0"/>
-                              <w:lang w:eastAsia="fr-CA"/>
-                              <w14:ligatures w14:val="none"/>
-                            </w:rPr>
-                            <m:t>w</m:t>
-                          </m:r>
-                        </m:e>
-                        <m:sub>
-                          <m:r>
-                            <w:rPr>
-                              <w:rFonts w:ascii="Cambria Math" w:eastAsia="Times New Roman" w:hAnsi="Cambria Math" w:cs="Times New Roman"/>
-                              <w:kern w:val="0"/>
-                              <w:lang w:eastAsia="fr-CA"/>
-                              <w14:ligatures w14:val="none"/>
-                            </w:rPr>
-                            <m:t>∙∙</m:t>
-                          </m:r>
-                        </m:sub>
-                      </m:sSub>
-                    </m:den>
-                  </m:f>
-                </m:e>
-              </m:d>
-              <m:r>
-                <w:rPr>
-                  <w:rFonts w:ascii="Cambria Math" w:eastAsia="Times New Roman" w:hAnsi="Cambria Math" w:cs="Times New Roman"/>
-                  <w:kern w:val="0"/>
-                  <w:lang w:eastAsia="fr-CA"/>
-                  <w14:ligatures w14:val="none"/>
-                </w:rPr>
-                <m:t>×</m:t>
-              </m:r>
-              <m:sSub>
-                <m:sSubPr>
-                  <m:ctrlPr>
-                    <w:rPr>
-                      <w:rFonts w:ascii="Cambria Math" w:eastAsia="Times New Roman" w:hAnsi="Cambria Math" w:cs="Times New Roman"/>
-                      <w:i/>
-                      <w:kern w:val="0"/>
-                      <w:lang w:eastAsia="fr-CA"/>
-                      <w14:ligatures w14:val="none"/>
-                    </w:rPr>
-                  </m:ctrlPr>
-                </m:sSubPr>
-                <m:e>
-                  <m:r>
-                    <w:rPr>
-                      <w:rFonts w:ascii="Cambria Math" w:eastAsia="Times New Roman" w:hAnsi="Cambria Math" w:cs="Times New Roman"/>
-                      <w:kern w:val="0"/>
-                      <w:lang w:eastAsia="fr-CA"/>
-                      <w14:ligatures w14:val="none"/>
-                    </w:rPr>
-                    <m:t>X</m:t>
-                  </m:r>
-                </m:e>
-                <m:sub>
-                  <m:r>
-                    <w:rPr>
-                      <w:rFonts w:ascii="Cambria Math" w:eastAsia="Times New Roman" w:hAnsi="Cambria Math" w:cs="Times New Roman"/>
-                      <w:kern w:val="0"/>
-                      <w:lang w:eastAsia="fr-CA"/>
-                      <w14:ligatures w14:val="none"/>
-                    </w:rPr>
-                    <m:t>iw</m:t>
-                  </m:r>
-                </m:sub>
-              </m:sSub>
-            </m:e>
-          </m:nary>
-        </m:oMath>
-      </m:oMathPara>
+      <m:oMath>
+        <m:acc>
+          <m:accPr>
+            <m:ctrlPr>
+              <w:rPr>
+                <w:rFonts w:ascii="Cambria Math" w:eastAsia="Times New Roman" w:hAnsi="Cambria Math" w:cs="Times New Roman"/>
+                <w:i/>
+                <w:kern w:val="0"/>
+                <w:lang w:eastAsia="fr-CA"/>
+                <w14:ligatures w14:val="none"/>
+              </w:rPr>
+            </m:ctrlPr>
+          </m:accPr>
+          <m:e>
+            <m:r>
+              <w:rPr>
+                <w:rFonts w:ascii="Cambria Math" w:eastAsia="Times New Roman" w:hAnsi="Cambria Math" w:cs="Times New Roman"/>
+                <w:kern w:val="0"/>
+                <w:lang w:eastAsia="fr-CA"/>
+                <w14:ligatures w14:val="none"/>
+              </w:rPr>
+              <m:t>m</m:t>
+            </m:r>
+          </m:e>
+        </m:acc>
+        <m:r>
+          <w:rPr>
+            <w:rFonts w:ascii="Cambria Math" w:eastAsia="Times New Roman" w:hAnsi="Cambria Math" w:cs="Times New Roman"/>
+            <w:kern w:val="0"/>
+            <w:lang w:eastAsia="fr-CA"/>
+            <w14:ligatures w14:val="none"/>
+          </w:rPr>
+          <m:t>=</m:t>
+        </m:r>
+        <m:sSub>
+          <m:sSubPr>
+            <m:ctrlPr>
+              <w:rPr>
+                <w:rFonts w:ascii="Cambria Math" w:eastAsia="Times New Roman" w:hAnsi="Cambria Math" w:cs="Times New Roman"/>
+                <w:i/>
+                <w:kern w:val="0"/>
+                <w:lang w:eastAsia="fr-CA"/>
+                <w14:ligatures w14:val="none"/>
+              </w:rPr>
+            </m:ctrlPr>
+          </m:sSubPr>
+          <m:e>
+            <m:r>
+              <w:rPr>
+                <w:rFonts w:ascii="Cambria Math" w:eastAsia="Times New Roman" w:hAnsi="Cambria Math" w:cs="Times New Roman"/>
+                <w:kern w:val="0"/>
+                <w:lang w:eastAsia="fr-CA"/>
+                <w14:ligatures w14:val="none"/>
+              </w:rPr>
+              <m:t>X</m:t>
+            </m:r>
+          </m:e>
+          <m:sub>
+            <m:r>
+              <w:rPr>
+                <w:rFonts w:ascii="Cambria Math" w:eastAsia="Times New Roman" w:hAnsi="Cambria Math" w:cs="Times New Roman"/>
+                <w:kern w:val="0"/>
+                <w:lang w:eastAsia="fr-CA"/>
+                <w14:ligatures w14:val="none"/>
+              </w:rPr>
+              <m:t>ww</m:t>
+            </m:r>
+          </m:sub>
+        </m:sSub>
+        <m:r>
+          <w:rPr>
+            <w:rFonts w:ascii="Cambria Math" w:eastAsia="Times New Roman" w:hAnsi="Cambria Math" w:cs="Times New Roman"/>
+            <w:kern w:val="0"/>
+            <w:lang w:eastAsia="fr-CA"/>
+            <w14:ligatures w14:val="none"/>
+          </w:rPr>
+          <m:t>=</m:t>
+        </m:r>
+        <m:nary>
+          <m:naryPr>
+            <m:chr m:val="∑"/>
+            <m:limLoc m:val="undOvr"/>
+            <m:ctrlPr>
+              <w:rPr>
+                <w:rFonts w:ascii="Cambria Math" w:eastAsia="Times New Roman" w:hAnsi="Cambria Math" w:cs="Times New Roman"/>
+                <w:i/>
+                <w:kern w:val="0"/>
+                <w:lang w:eastAsia="fr-CA"/>
+                <w14:ligatures w14:val="none"/>
+              </w:rPr>
+            </m:ctrlPr>
+          </m:naryPr>
+          <m:sub>
+            <m:r>
+              <w:rPr>
+                <w:rFonts w:ascii="Cambria Math" w:eastAsia="Times New Roman" w:hAnsi="Cambria Math" w:cs="Times New Roman"/>
+                <w:kern w:val="0"/>
+                <w:lang w:eastAsia="fr-CA"/>
+                <w14:ligatures w14:val="none"/>
+              </w:rPr>
+              <m:t>i=1</m:t>
+            </m:r>
+          </m:sub>
+          <m:sup>
+            <m:r>
+              <w:rPr>
+                <w:rFonts w:ascii="Cambria Math" w:eastAsia="Times New Roman" w:hAnsi="Cambria Math" w:cs="Times New Roman"/>
+                <w:kern w:val="0"/>
+                <w:lang w:eastAsia="fr-CA"/>
+                <w14:ligatures w14:val="none"/>
+              </w:rPr>
+              <m:t>I</m:t>
+            </m:r>
+          </m:sup>
+          <m:e>
+            <m:d>
+              <m:dPr>
+                <m:ctrlPr>
+                  <w:rPr>
+                    <w:rFonts w:ascii="Cambria Math" w:eastAsia="Times New Roman" w:hAnsi="Cambria Math" w:cs="Times New Roman"/>
+                    <w:i/>
+                    <w:kern w:val="0"/>
+                    <w:lang w:eastAsia="fr-CA"/>
+                    <w14:ligatures w14:val="none"/>
+                  </w:rPr>
+                </m:ctrlPr>
+              </m:dPr>
+              <m:e>
+                <m:f>
+                  <m:fPr>
+                    <m:ctrlPr>
+                      <w:rPr>
+                        <w:rFonts w:ascii="Cambria Math" w:eastAsia="Times New Roman" w:hAnsi="Cambria Math" w:cs="Times New Roman"/>
+                        <w:i/>
+                        <w:kern w:val="0"/>
+                        <w:lang w:eastAsia="fr-CA"/>
+                        <w14:ligatures w14:val="none"/>
+                      </w:rPr>
+                    </m:ctrlPr>
+                  </m:fPr>
+                  <m:num>
+                    <m:sSub>
+                      <m:sSubPr>
+                        <m:ctrlPr>
+                          <w:rPr>
+                            <w:rFonts w:ascii="Cambria Math" w:eastAsia="Times New Roman" w:hAnsi="Cambria Math" w:cs="Times New Roman"/>
+                            <w:i/>
+                            <w:kern w:val="0"/>
+                            <w:lang w:eastAsia="fr-CA"/>
+                            <w14:ligatures w14:val="none"/>
+                          </w:rPr>
+                        </m:ctrlPr>
+                      </m:sSubPr>
+                      <m:e>
+                        <m:r>
+                          <w:rPr>
+                            <w:rFonts w:ascii="Cambria Math" w:eastAsia="Times New Roman" w:hAnsi="Cambria Math" w:cs="Times New Roman"/>
+                            <w:kern w:val="0"/>
+                            <w:lang w:eastAsia="fr-CA"/>
+                            <w14:ligatures w14:val="none"/>
+                          </w:rPr>
+                          <m:t>w</m:t>
+                        </m:r>
+                      </m:e>
+                      <m:sub>
+                        <m:r>
+                          <w:rPr>
+                            <w:rFonts w:ascii="Cambria Math" w:eastAsia="Times New Roman" w:hAnsi="Cambria Math" w:cs="Times New Roman"/>
+                            <w:kern w:val="0"/>
+                            <w:lang w:eastAsia="fr-CA"/>
+                            <w14:ligatures w14:val="none"/>
+                          </w:rPr>
+                          <m:t>i∙</m:t>
+                        </m:r>
+                      </m:sub>
+                    </m:sSub>
+                  </m:num>
+                  <m:den>
+                    <m:sSub>
+                      <m:sSubPr>
+                        <m:ctrlPr>
+                          <w:rPr>
+                            <w:rFonts w:ascii="Cambria Math" w:eastAsia="Times New Roman" w:hAnsi="Cambria Math" w:cs="Times New Roman"/>
+                            <w:i/>
+                            <w:kern w:val="0"/>
+                            <w:lang w:eastAsia="fr-CA"/>
+                            <w14:ligatures w14:val="none"/>
+                          </w:rPr>
+                        </m:ctrlPr>
+                      </m:sSubPr>
+                      <m:e>
+                        <m:r>
+                          <w:rPr>
+                            <w:rFonts w:ascii="Cambria Math" w:eastAsia="Times New Roman" w:hAnsi="Cambria Math" w:cs="Times New Roman"/>
+                            <w:kern w:val="0"/>
+                            <w:lang w:eastAsia="fr-CA"/>
+                            <w14:ligatures w14:val="none"/>
+                          </w:rPr>
+                          <m:t>w</m:t>
+                        </m:r>
+                      </m:e>
+                      <m:sub>
+                        <m:r>
+                          <w:rPr>
+                            <w:rFonts w:ascii="Cambria Math" w:eastAsia="Times New Roman" w:hAnsi="Cambria Math" w:cs="Times New Roman"/>
+                            <w:kern w:val="0"/>
+                            <w:lang w:eastAsia="fr-CA"/>
+                            <w14:ligatures w14:val="none"/>
+                          </w:rPr>
+                          <m:t>∙∙</m:t>
+                        </m:r>
+                      </m:sub>
+                    </m:sSub>
+                  </m:den>
+                </m:f>
+              </m:e>
+            </m:d>
+            <m:r>
+              <w:rPr>
+                <w:rFonts w:ascii="Cambria Math" w:eastAsia="Times New Roman" w:hAnsi="Cambria Math" w:cs="Times New Roman"/>
+                <w:kern w:val="0"/>
+                <w:lang w:eastAsia="fr-CA"/>
+                <w14:ligatures w14:val="none"/>
+              </w:rPr>
+              <m:t>×</m:t>
+            </m:r>
+            <m:sSub>
+              <m:sSubPr>
+                <m:ctrlPr>
+                  <w:rPr>
+                    <w:rFonts w:ascii="Cambria Math" w:eastAsia="Times New Roman" w:hAnsi="Cambria Math" w:cs="Times New Roman"/>
+                    <w:i/>
+                    <w:kern w:val="0"/>
+                    <w:lang w:eastAsia="fr-CA"/>
+                    <w14:ligatures w14:val="none"/>
+                  </w:rPr>
+                </m:ctrlPr>
+              </m:sSubPr>
+              <m:e>
+                <m:r>
+                  <w:rPr>
+                    <w:rFonts w:ascii="Cambria Math" w:eastAsia="Times New Roman" w:hAnsi="Cambria Math" w:cs="Times New Roman"/>
+                    <w:kern w:val="0"/>
+                    <w:lang w:eastAsia="fr-CA"/>
+                    <w14:ligatures w14:val="none"/>
+                  </w:rPr>
+                  <m:t>X</m:t>
+                </m:r>
+              </m:e>
+              <m:sub>
+                <m:r>
+                  <w:rPr>
+                    <w:rFonts w:ascii="Cambria Math" w:eastAsia="Times New Roman" w:hAnsi="Cambria Math" w:cs="Times New Roman"/>
+                    <w:kern w:val="0"/>
+                    <w:lang w:eastAsia="fr-CA"/>
+                    <w14:ligatures w14:val="none"/>
+                  </w:rPr>
+                  <m:t>iw</m:t>
+                </m:r>
+              </m:sub>
+            </m:sSub>
+          </m:e>
+        </m:nary>
+      </m:oMath>
+      <w:r>
+        <w:rPr>
+          <w:rFonts w:eastAsia="Times New Roman" w:cs="Times New Roman"/>
+          <w:kern w:val="0"/>
+          <w:lang w:eastAsia="fr-CA"/>
+          <w14:ligatures w14:val="none"/>
+        </w:rPr>
+        <w:t xml:space="preserve">   </w:t>
+      </w:r>
     </w:p>
     <w:p>
       <w:pPr>
@@ -2426,27 +2314,7 @@
           <w:lang w:eastAsia="fr-CA"/>
           <w14:ligatures w14:val="none"/>
         </w:rPr>
-        <w:t xml:space="preserve">a prime de crédibilité de </w:t>
-      </w:r>
-      <w:proofErr w:type="spellStart"/>
-      <w:r>
-        <w:rPr>
-          <w:rFonts w:eastAsia="Times New Roman" w:cs="Times New Roman"/>
-          <w:kern w:val="0"/>
-          <w:lang w:eastAsia="fr-CA"/>
-          <w14:ligatures w14:val="none"/>
-        </w:rPr>
-        <w:t>Bühlmann</w:t>
-      </w:r>
-      <w:proofErr w:type="spellEnd"/>
-      <w:r>
-        <w:rPr>
-          <w:rFonts w:eastAsia="Times New Roman" w:cs="Times New Roman"/>
-          <w:kern w:val="0"/>
-          <w:lang w:eastAsia="fr-CA"/>
-          <w14:ligatures w14:val="none"/>
-        </w:rPr>
-        <w:t>–Straub :</w:t>
+        <w:t>a prime de crédibilité de Bühlmann–Straub :</w:t>
       </w:r>
     </w:p>
     <w:p>
@@ -2456,7 +2324,9 @@
         <w:contextualSpacing w:val="0"/>
         <w:jc w:val="center"/>
         <w:rPr>
-          <w:rFonts w:ascii="Cambria Math" w:eastAsia="Times New Roman" w:hAnsi="Cambria Math" w:cs="Times New Roman"/>
+          <w:rFonts w:ascii="Times New Roman" w:eastAsia="Times New Roman" w:hAnsi="Times New Roman" w:cs="Times New Roman"/>
+          <w:b/>
+          <w:bCs/>
           <w:kern w:val="0"/>
           <w:sz w:val="24"/>
           <w:szCs w:val="24"/>
@@ -2914,19 +2784,17 @@
           <m:t>.</m:t>
         </m:r>
       </m:oMath>
-    </w:p>
-    <w:p>
-      <w:pPr>
-        <w:pStyle w:val="Paragraphedeliste"/>
-        <w:spacing w:after="120" w:line="240" w:lineRule="auto"/>
-        <w:contextualSpacing w:val="0"/>
-        <w:rPr>
-          <w:rFonts w:eastAsia="Times New Roman" w:cs="Times New Roman"/>
+      <w:r>
+        <w:rPr>
+          <w:rFonts w:ascii="Cambria Math" w:eastAsia="Times New Roman" w:hAnsi="Cambria Math" w:cs="Times New Roman"/>
           <w:kern w:val="0"/>
+          <w:sz w:val="24"/>
+          <w:szCs w:val="24"/>
           <w:lang w:eastAsia="fr-CA"/>
           <w14:ligatures w14:val="none"/>
         </w:rPr>
-      </w:pPr>
+        <w:br/>
+      </w:r>
     </w:p>
     <w:p>
       <w:pPr>
@@ -2966,89 +2834,23 @@
         </w:rPr>
         <w:t xml:space="preserve">Dans notre application, nous présentons trois modèles de crédibilité, soit </w:t>
       </w:r>
+      <w:proofErr w:type="gramStart"/>
       <w:r>
         <w:rPr>
           <w:rFonts w:asciiTheme="minorHAnsi" w:hAnsiTheme="minorHAnsi"/>
           <w:sz w:val="22"/>
           <w:szCs w:val="22"/>
         </w:rPr>
-        <w:t>le modèle bayésien</w:t>
-      </w:r>
+        <w:t>les modèles bayésien</w:t>
+      </w:r>
+      <w:proofErr w:type="gramEnd"/>
       <w:r>
         <w:rPr>
           <w:rFonts w:asciiTheme="minorHAnsi" w:hAnsiTheme="minorHAnsi"/>
           <w:sz w:val="22"/>
           <w:szCs w:val="22"/>
         </w:rPr>
-        <w:t xml:space="preserve">, </w:t>
-      </w:r>
-      <w:r>
-        <w:rPr>
-          <w:rFonts w:asciiTheme="minorHAnsi" w:hAnsiTheme="minorHAnsi"/>
-          <w:sz w:val="22"/>
-          <w:szCs w:val="22"/>
-        </w:rPr>
-        <w:t xml:space="preserve">le modèle </w:t>
-      </w:r>
-      <w:r>
-        <w:rPr>
-          <w:rFonts w:asciiTheme="minorHAnsi" w:hAnsiTheme="minorHAnsi"/>
-          <w:sz w:val="22"/>
-          <w:szCs w:val="22"/>
-        </w:rPr>
-        <w:t xml:space="preserve">de </w:t>
-      </w:r>
-      <w:proofErr w:type="spellStart"/>
-      <w:r>
-        <w:rPr>
-          <w:rFonts w:asciiTheme="minorHAnsi" w:hAnsiTheme="minorHAnsi"/>
-          <w:sz w:val="22"/>
-          <w:szCs w:val="22"/>
-        </w:rPr>
-        <w:t>Bühlmann</w:t>
-      </w:r>
-      <w:proofErr w:type="spellEnd"/>
-      <w:r>
-        <w:rPr>
-          <w:rFonts w:asciiTheme="minorHAnsi" w:hAnsiTheme="minorHAnsi"/>
-          <w:sz w:val="22"/>
-          <w:szCs w:val="22"/>
-        </w:rPr>
-        <w:t xml:space="preserve"> et </w:t>
-      </w:r>
-      <w:r>
-        <w:rPr>
-          <w:rFonts w:asciiTheme="minorHAnsi" w:hAnsiTheme="minorHAnsi"/>
-          <w:sz w:val="22"/>
-          <w:szCs w:val="22"/>
-        </w:rPr>
-        <w:t xml:space="preserve">le modèle </w:t>
-      </w:r>
-      <w:r>
-        <w:rPr>
-          <w:rFonts w:asciiTheme="minorHAnsi" w:hAnsiTheme="minorHAnsi"/>
-          <w:sz w:val="22"/>
-          <w:szCs w:val="22"/>
-        </w:rPr>
-        <w:t xml:space="preserve">de </w:t>
-      </w:r>
-      <w:proofErr w:type="spellStart"/>
-      <w:r>
-        <w:rPr>
-          <w:rFonts w:asciiTheme="minorHAnsi" w:hAnsiTheme="minorHAnsi"/>
-          <w:sz w:val="22"/>
-          <w:szCs w:val="22"/>
-        </w:rPr>
-        <w:t>Bühlmann</w:t>
-      </w:r>
-      <w:proofErr w:type="spellEnd"/>
-      <w:r>
-        <w:rPr>
-          <w:rFonts w:asciiTheme="minorHAnsi" w:hAnsiTheme="minorHAnsi"/>
-          <w:sz w:val="22"/>
-          <w:szCs w:val="22"/>
-        </w:rPr>
-        <w:t>-Straub, afin de comparer leurs performances.</w:t>
+        <w:t>, de Bühlmann et de Bühlmann-Straub, afin de comparer leurs performances.</w:t>
       </w:r>
     </w:p>
     <w:p>
@@ -3086,25 +2888,7 @@
           <w:sz w:val="22"/>
           <w:szCs w:val="22"/>
         </w:rPr>
-        <w:t xml:space="preserve">Bien que les trois modèles soient présentés dans l’application, le modèle de </w:t>
-      </w:r>
-      <w:proofErr w:type="spellStart"/>
-      <w:r>
-        <w:rPr>
-          <w:rFonts w:asciiTheme="minorHAnsi" w:hAnsiTheme="minorHAnsi"/>
-          <w:sz w:val="22"/>
-          <w:szCs w:val="22"/>
-        </w:rPr>
-        <w:t>Bühlmann</w:t>
-      </w:r>
-      <w:proofErr w:type="spellEnd"/>
-      <w:r>
-        <w:rPr>
-          <w:rFonts w:asciiTheme="minorHAnsi" w:hAnsiTheme="minorHAnsi"/>
-          <w:sz w:val="22"/>
-          <w:szCs w:val="22"/>
-        </w:rPr>
-        <w:t xml:space="preserve">-Straub est particulièrement pertinent dans notre contexte puisqu’il permet de tenir compte de l’exposition au risque à l’aide de poids </w:t>
+        <w:t xml:space="preserve">Bien que les trois modèles soient présentés dans l’application, le modèle de Bühlmann-Straub est particulièrement pertinent dans notre contexte puisqu’il permet de tenir compte de l’exposition au risque à l’aide de poids </w:t>
       </w:r>
       <m:oMath>
         <m:sSub>
@@ -3164,25 +2948,7 @@
           <w:sz w:val="22"/>
           <w:szCs w:val="22"/>
         </w:rPr>
-        <w:t xml:space="preserve">Ainsi, en fonction des résultats empiriques et de la capacité du modèle à bien représenter l’exposition, le modèle de </w:t>
-      </w:r>
-      <w:proofErr w:type="spellStart"/>
-      <w:r>
-        <w:rPr>
-          <w:rFonts w:asciiTheme="minorHAnsi" w:hAnsiTheme="minorHAnsi"/>
-          <w:sz w:val="22"/>
-          <w:szCs w:val="22"/>
-        </w:rPr>
-        <w:t>Bühlmann</w:t>
-      </w:r>
-      <w:proofErr w:type="spellEnd"/>
-      <w:r>
-        <w:rPr>
-          <w:rFonts w:asciiTheme="minorHAnsi" w:hAnsiTheme="minorHAnsi"/>
-          <w:sz w:val="22"/>
-          <w:szCs w:val="22"/>
-        </w:rPr>
-        <w:t>-Straub peut être recommandé comme modèle principal.</w:t>
+        <w:t>Ainsi, en fonction des résultats empiriques et de la capacité du modèle à bien représenter l’exposition, le modèle de Bühlmann-Straub peut être recommandé comme modèle principal.</w:t>
       </w:r>
     </w:p>
     <w:p>
@@ -4546,6 +4312,23 @@
 </file>
 
 <file path=customXml/item1.xml><?xml version="1.0" encoding="utf-8"?>
+<p:properties xmlns:p="http://schemas.microsoft.com/office/2006/metadata/properties" xmlns:xsi="http://www.w3.org/2001/XMLSchema-instance" xmlns:pc="http://schemas.microsoft.com/office/infopath/2007/PartnerControls">
+  <documentManagement>
+    <_activity xmlns="7cd8c61a-fd18-4603-8755-d91a22d67d2b" xsi:nil="true"/>
+  </documentManagement>
+</p:properties>
+</file>
+
+<file path=customXml/item2.xml><?xml version="1.0" encoding="utf-8"?>
+<?mso-contentType ?>
+<FormTemplates xmlns="http://schemas.microsoft.com/sharepoint/v3/contenttype/forms">
+  <Display>DocumentLibraryForm</Display>
+  <Edit>DocumentLibraryForm</Edit>
+  <New>DocumentLibraryForm</New>
+</FormTemplates>
+</file>
+
+<file path=customXml/item3.xml><?xml version="1.0" encoding="utf-8"?>
 <ct:contentTypeSchema xmlns:ct="http://schemas.microsoft.com/office/2006/metadata/contentType" xmlns:ma="http://schemas.microsoft.com/office/2006/metadata/properties/metaAttributes" ct:_="" ma:_="" ma:contentTypeName="Document" ma:contentTypeID="0x010100C34E2965E001094BB667583607E2D7E3" ma:contentTypeVersion="8" ma:contentTypeDescription="Create a new document." ma:contentTypeScope="" ma:versionID="73661d776941e9e3c710a32cd248c220">
   <xsd:schema xmlns:xsd="http://www.w3.org/2001/XMLSchema" xmlns:xs="http://www.w3.org/2001/XMLSchema" xmlns:p="http://schemas.microsoft.com/office/2006/metadata/properties" xmlns:ns3="7cd8c61a-fd18-4603-8755-d91a22d67d2b" xmlns:ns4="1f336702-64c3-405d-b44c-b3f5d9ffe49b" targetNamespace="http://schemas.microsoft.com/office/2006/metadata/properties" ma:root="true" ma:fieldsID="ba50763595f2e038a40d1a9ef53661d7" ns3:_="" ns4:_="">
     <xsd:import namespace="7cd8c61a-fd18-4603-8755-d91a22d67d2b"/>
@@ -4734,24 +4517,25 @@
 </ct:contentTypeSchema>
 </file>
 
-<file path=customXml/item2.xml><?xml version="1.0" encoding="utf-8"?>
-<?mso-contentType ?>
-<FormTemplates xmlns="http://schemas.microsoft.com/sharepoint/v3/contenttype/forms">
-  <Display>DocumentLibraryForm</Display>
-  <Edit>DocumentLibraryForm</Edit>
-  <New>DocumentLibraryForm</New>
-</FormTemplates>
+<file path=customXml/itemProps1.xml><?xml version="1.0" encoding="utf-8"?>
+<ds:datastoreItem xmlns:ds="http://schemas.openxmlformats.org/officeDocument/2006/customXml" ds:itemID="{F846B2DC-6610-43C6-86D1-D3F5854E6D47}">
+  <ds:schemaRefs>
+    <ds:schemaRef ds:uri="http://schemas.microsoft.com/office/2006/metadata/properties"/>
+    <ds:schemaRef ds:uri="http://schemas.microsoft.com/office/infopath/2007/PartnerControls"/>
+    <ds:schemaRef ds:uri="7cd8c61a-fd18-4603-8755-d91a22d67d2b"/>
+  </ds:schemaRefs>
+</ds:datastoreItem>
 </file>
 
-<file path=customXml/item3.xml><?xml version="1.0" encoding="utf-8"?>
-<p:properties xmlns:p="http://schemas.microsoft.com/office/2006/metadata/properties" xmlns:xsi="http://www.w3.org/2001/XMLSchema-instance" xmlns:pc="http://schemas.microsoft.com/office/infopath/2007/PartnerControls">
-  <documentManagement>
-    <_activity xmlns="7cd8c61a-fd18-4603-8755-d91a22d67d2b" xsi:nil="true"/>
-  </documentManagement>
-</p:properties>
+<file path=customXml/itemProps2.xml><?xml version="1.0" encoding="utf-8"?>
+<ds:datastoreItem xmlns:ds="http://schemas.openxmlformats.org/officeDocument/2006/customXml" ds:itemID="{4BF2ACCA-A08C-447D-9B60-491EFF60D57A}">
+  <ds:schemaRefs>
+    <ds:schemaRef ds:uri="http://schemas.microsoft.com/sharepoint/v3/contenttype/forms"/>
+  </ds:schemaRefs>
+</ds:datastoreItem>
 </file>
 
-<file path=customXml/itemProps1.xml><?xml version="1.0" encoding="utf-8"?>
+<file path=customXml/itemProps3.xml><?xml version="1.0" encoding="utf-8"?>
 <ds:datastoreItem xmlns:ds="http://schemas.openxmlformats.org/officeDocument/2006/customXml" ds:itemID="{DFF3C3D9-2FD0-49BB-9541-8E240B5F0EA3}">
   <ds:schemaRefs>
     <ds:schemaRef ds:uri="http://schemas.microsoft.com/office/2006/metadata/contentType"/>
@@ -4768,22 +4552,4 @@
     <ds:schemaRef ds:uri="http://schemas.microsoft.com/internal/obd"/>
   </ds:schemaRefs>
 </ds:datastoreItem>
-</file>
-
-<file path=customXml/itemProps2.xml><?xml version="1.0" encoding="utf-8"?>
-<ds:datastoreItem xmlns:ds="http://schemas.openxmlformats.org/officeDocument/2006/customXml" ds:itemID="{4BF2ACCA-A08C-447D-9B60-491EFF60D57A}">
-  <ds:schemaRefs>
-    <ds:schemaRef ds:uri="http://schemas.microsoft.com/sharepoint/v3/contenttype/forms"/>
-  </ds:schemaRefs>
-</ds:datastoreItem>
-</file>
-
-<file path=customXml/itemProps3.xml><?xml version="1.0" encoding="utf-8"?>
-<ds:datastoreItem xmlns:ds="http://schemas.openxmlformats.org/officeDocument/2006/customXml" ds:itemID="{F846B2DC-6610-43C6-86D1-D3F5854E6D47}">
-  <ds:schemaRefs>
-    <ds:schemaRef ds:uri="http://schemas.microsoft.com/office/2006/metadata/properties"/>
-    <ds:schemaRef ds:uri="http://schemas.microsoft.com/office/infopath/2007/PartnerControls"/>
-    <ds:schemaRef ds:uri="7cd8c61a-fd18-4603-8755-d91a22d67d2b"/>
-  </ds:schemaRefs>
-</ds:datastoreItem>
 </file>
</xml_diff>